<commit_message>
upd. User guide (v6.0)
</commit_message>
<xml_diff>
--- a/ImpactCalc/Руководство пользователя.docx
+++ b/ImpactCalc/Руководство пользователя.docx
@@ -69,7 +69,7 @@
           <w:sz w:val="28"/>
           <w:szCs w:val="28"/>
         </w:rPr>
-        <w:t>5</w:t>
+        <w:t>6</w:t>
       </w:r>
       <w:r>
         <w:rPr>
@@ -641,7 +641,7 @@
             <v:path o:extrusionok="f" gradientshapeok="t" o:connecttype="rect"/>
             <o:lock v:ext="edit" aspectratio="t"/>
           </v:shapetype>
-          <v:shape id="_x0000_i1025" type="#_x0000_t75" style="width:324.75pt;height:218.25pt">
+          <v:shape id="_x0000_i1025" type="#_x0000_t75" style="width:324.7pt;height:218.05pt">
             <v:imagedata r:id="rId5" o:title="Снимок1"/>
           </v:shape>
         </w:pict>
@@ -693,7 +693,7 @@
           <w:szCs w:val="24"/>
         </w:rPr>
         <w:pict>
-          <v:shape id="_x0000_i1026" type="#_x0000_t75" style="width:324.75pt;height:216.75pt">
+          <v:shape id="_x0000_i1026" type="#_x0000_t75" style="width:324.7pt;height:216.7pt">
             <v:imagedata r:id="rId6" o:title="Снимок2"/>
           </v:shape>
         </w:pict>
@@ -856,7 +856,7 @@
           <w:szCs w:val="24"/>
         </w:rPr>
         <w:pict>
-          <v:shape id="_x0000_i1027" type="#_x0000_t75" style="width:467.25pt;height:171pt">
+          <v:shape id="_x0000_i1027" type="#_x0000_t75" style="width:467.3pt;height:171.15pt">
             <v:imagedata r:id="rId7" o:title="Снимок3"/>
           </v:shape>
         </w:pict>
@@ -1005,6 +1005,224 @@
           <w:sz w:val="26"/>
           <w:szCs w:val="26"/>
         </w:rPr>
+        <w:t xml:space="preserve">Динамика роста ВДС. </w:t>
+      </w:r>
+      <w:r>
+        <w:rPr>
+          <w:rFonts w:ascii="Times New Roman" w:hAnsi="Times New Roman" w:cs="Times New Roman"/>
+          <w:sz w:val="26"/>
+          <w:szCs w:val="26"/>
+        </w:rPr>
+        <w:t>Программное средство позволяет в том числе построить график с динамикой роста нижней и верхней границы потенциальной выгоды внедрения ИИ-основанных решений в зависимости от УГТ. Для этого необходимо выполнить основные шаги алгоритма (см. подраздел «Запуск и использование»), а после 6 шага в верхнем меню нажать «Дополнительно» и в выпавшем списке нажать «Динамика роста ВДС».</w:t>
+      </w:r>
+    </w:p>
+    <w:p>
+      <w:pPr>
+        <w:pStyle w:val="a3"/>
+        <w:tabs>
+          <w:tab w:val="left" w:pos="851"/>
+        </w:tabs>
+        <w:spacing w:after="0" w:line="360" w:lineRule="auto"/>
+        <w:ind w:left="-567" w:firstLine="567"/>
+        <w:jc w:val="both"/>
+        <w:rPr>
+          <w:rFonts w:ascii="Times New Roman" w:hAnsi="Times New Roman" w:cs="Times New Roman"/>
+          <w:sz w:val="26"/>
+          <w:szCs w:val="26"/>
+        </w:rPr>
+      </w:pPr>
+      <w:r>
+        <w:rPr>
+          <w:rFonts w:ascii="Times New Roman" w:hAnsi="Times New Roman" w:cs="Times New Roman"/>
+          <w:sz w:val="26"/>
+          <w:szCs w:val="26"/>
+        </w:rPr>
+        <w:t>После этого откроется дополнительное окно с график</w:t>
+      </w:r>
+      <w:r>
+        <w:rPr>
+          <w:rFonts w:ascii="Times New Roman" w:hAnsi="Times New Roman" w:cs="Times New Roman"/>
+          <w:sz w:val="26"/>
+          <w:szCs w:val="26"/>
+        </w:rPr>
+        <w:t>ом</w:t>
+      </w:r>
+      <w:r>
+        <w:rPr>
+          <w:rFonts w:ascii="Times New Roman" w:hAnsi="Times New Roman" w:cs="Times New Roman"/>
+          <w:sz w:val="26"/>
+          <w:szCs w:val="26"/>
+        </w:rPr>
+        <w:t xml:space="preserve"> верхней и нижней </w:t>
+      </w:r>
+      <w:r>
+        <w:rPr>
+          <w:rFonts w:ascii="Times New Roman" w:hAnsi="Times New Roman" w:cs="Times New Roman"/>
+          <w:sz w:val="26"/>
+          <w:szCs w:val="26"/>
+        </w:rPr>
+        <w:t xml:space="preserve">границы </w:t>
+      </w:r>
+      <w:r>
+        <w:rPr>
+          <w:rFonts w:ascii="Times New Roman" w:hAnsi="Times New Roman" w:cs="Times New Roman"/>
+          <w:sz w:val="26"/>
+          <w:szCs w:val="26"/>
+        </w:rPr>
+        <w:t xml:space="preserve">потенциального роста ВДС </w:t>
+      </w:r>
+      <w:r>
+        <w:rPr>
+          <w:rFonts w:ascii="Times New Roman" w:hAnsi="Times New Roman" w:cs="Times New Roman"/>
+          <w:sz w:val="26"/>
+          <w:szCs w:val="26"/>
+        </w:rPr>
+        <w:t>при разной</w:t>
+      </w:r>
+      <w:r>
+        <w:rPr>
+          <w:rFonts w:ascii="Times New Roman" w:hAnsi="Times New Roman" w:cs="Times New Roman"/>
+          <w:sz w:val="26"/>
+          <w:szCs w:val="26"/>
+        </w:rPr>
+        <w:t xml:space="preserve"> степ</w:t>
+      </w:r>
+      <w:r>
+        <w:rPr>
+          <w:rFonts w:ascii="Times New Roman" w:hAnsi="Times New Roman" w:cs="Times New Roman"/>
+          <w:sz w:val="26"/>
+          <w:szCs w:val="26"/>
+        </w:rPr>
+        <w:t>ени УГТ, начиная с заданной при выполненном ранее вычислении.</w:t>
+      </w:r>
+      <w:r>
+        <w:rPr>
+          <w:rFonts w:ascii="Times New Roman" w:hAnsi="Times New Roman" w:cs="Times New Roman"/>
+          <w:sz w:val="26"/>
+          <w:szCs w:val="26"/>
+        </w:rPr>
+        <w:t xml:space="preserve"> </w:t>
+      </w:r>
+      <w:r>
+        <w:rPr>
+          <w:rFonts w:ascii="Times New Roman" w:hAnsi="Times New Roman" w:cs="Times New Roman"/>
+          <w:sz w:val="26"/>
+          <w:szCs w:val="26"/>
+        </w:rPr>
+        <w:t xml:space="preserve">Так, на рисунке 4 показан пример такого графика для вычисления потенциальной выгоды от внедрения в оптимизационную задачу с экономической значимостью 0,25. Исходное вычисление было выполнено при уровне </w:t>
+      </w:r>
+      <w:r>
+        <w:rPr>
+          <w:rFonts w:ascii="Times New Roman" w:hAnsi="Times New Roman" w:cs="Times New Roman"/>
+          <w:sz w:val="26"/>
+          <w:szCs w:val="26"/>
+        </w:rPr>
+        <w:lastRenderedPageBreak/>
+        <w:t>УГТ-3, соответственно динамика роста строится от УГТ-3 до УГТ-9 (см. рис. 4). В текущей версии программного средства динамику роста можно посчитать только для одного внедрения (на примере одной задачи).</w:t>
+      </w:r>
+    </w:p>
+    <w:p>
+      <w:pPr>
+        <w:pStyle w:val="a3"/>
+        <w:tabs>
+          <w:tab w:val="left" w:pos="851"/>
+        </w:tabs>
+        <w:spacing w:after="0" w:line="360" w:lineRule="auto"/>
+        <w:ind w:left="-567" w:firstLine="567"/>
+        <w:jc w:val="both"/>
+        <w:rPr>
+          <w:rFonts w:ascii="Times New Roman" w:hAnsi="Times New Roman" w:cs="Times New Roman"/>
+          <w:sz w:val="26"/>
+          <w:szCs w:val="26"/>
+        </w:rPr>
+      </w:pPr>
+      <w:r>
+        <w:rPr>
+          <w:rFonts w:ascii="Times New Roman" w:hAnsi="Times New Roman" w:cs="Times New Roman"/>
+          <w:sz w:val="26"/>
+          <w:szCs w:val="26"/>
+          <w:lang w:val="en-US"/>
+        </w:rPr>
+        <w:pict>
+          <v:shape id="_x0000_i1029" type="#_x0000_t75" style="width:467.3pt;height:224.85pt">
+            <v:imagedata r:id="rId8" o:title="Безымянный"/>
+          </v:shape>
+        </w:pict>
+      </w:r>
+    </w:p>
+    <w:p>
+      <w:pPr>
+        <w:pStyle w:val="a3"/>
+        <w:tabs>
+          <w:tab w:val="left" w:pos="851"/>
+        </w:tabs>
+        <w:spacing w:after="0" w:line="360" w:lineRule="auto"/>
+        <w:ind w:left="-567" w:firstLine="567"/>
+        <w:jc w:val="center"/>
+        <w:rPr>
+          <w:rFonts w:ascii="Times New Roman" w:hAnsi="Times New Roman" w:cs="Times New Roman"/>
+          <w:sz w:val="26"/>
+          <w:szCs w:val="26"/>
+        </w:rPr>
+      </w:pPr>
+      <w:r>
+        <w:rPr>
+          <w:rFonts w:ascii="Times New Roman" w:hAnsi="Times New Roman" w:cs="Times New Roman"/>
+          <w:sz w:val="26"/>
+          <w:szCs w:val="26"/>
+        </w:rPr>
+        <w:t xml:space="preserve">Рис. 4. Динамика нижней </w:t>
+      </w:r>
+      <w:r>
+        <w:rPr>
+          <w:rFonts w:ascii="Times New Roman" w:hAnsi="Times New Roman" w:cs="Times New Roman"/>
+          <w:sz w:val="26"/>
+          <w:szCs w:val="26"/>
+        </w:rPr>
+        <w:t>и верхней границы потенциального роста ВДС</w:t>
+      </w:r>
+      <w:r>
+        <w:rPr>
+          <w:rFonts w:ascii="Times New Roman" w:hAnsi="Times New Roman" w:cs="Times New Roman"/>
+          <w:sz w:val="26"/>
+          <w:szCs w:val="26"/>
+        </w:rPr>
+        <w:t xml:space="preserve"> в зависимости от уровня технологической г</w:t>
+      </w:r>
+      <w:bookmarkStart w:id="0" w:name="_GoBack"/>
+      <w:bookmarkEnd w:id="0"/>
+      <w:r>
+        <w:rPr>
+          <w:rFonts w:ascii="Times New Roman" w:hAnsi="Times New Roman" w:cs="Times New Roman"/>
+          <w:sz w:val="26"/>
+          <w:szCs w:val="26"/>
+        </w:rPr>
+        <w:t>отовности</w:t>
+      </w:r>
+    </w:p>
+    <w:p>
+      <w:pPr>
+        <w:pStyle w:val="a3"/>
+        <w:tabs>
+          <w:tab w:val="left" w:pos="851"/>
+        </w:tabs>
+        <w:spacing w:after="0" w:line="360" w:lineRule="auto"/>
+        <w:ind w:left="-567" w:firstLine="567"/>
+        <w:jc w:val="both"/>
+        <w:rPr>
+          <w:rFonts w:ascii="Times New Roman" w:hAnsi="Times New Roman" w:cs="Times New Roman"/>
+          <w:sz w:val="26"/>
+          <w:szCs w:val="26"/>
+        </w:rPr>
+      </w:pPr>
+      <w:r>
+        <w:rPr>
+          <w:rFonts w:ascii="Times New Roman" w:hAnsi="Times New Roman" w:cs="Times New Roman"/>
+          <w:b/>
+          <w:i/>
+          <w:sz w:val="26"/>
+          <w:szCs w:val="26"/>
+        </w:rPr>
         <w:t xml:space="preserve">Математический аппарат. </w:t>
       </w:r>
       <w:r>
@@ -1013,15 +1231,7 @@
           <w:sz w:val="26"/>
           <w:szCs w:val="26"/>
         </w:rPr>
-        <w:t>Как было описано ранее, м</w:t>
-      </w:r>
-      <w:r>
-        <w:rPr>
-          <w:rFonts w:ascii="Times New Roman" w:hAnsi="Times New Roman" w:cs="Times New Roman"/>
-          <w:sz w:val="26"/>
-          <w:szCs w:val="26"/>
-        </w:rPr>
-        <w:t xml:space="preserve">одель оценки потенциальной выгоды </w:t>
+        <w:t xml:space="preserve">Как было описано ранее, модель оценки потенциальной выгоды </w:t>
       </w:r>
       <m:oMath>
         <m:r>
@@ -1048,23 +1258,7 @@
           <w:sz w:val="26"/>
           <w:szCs w:val="26"/>
         </w:rPr>
-        <w:t xml:space="preserve">от внедрения МО/ИИ-основанных подходов реализована </w:t>
-      </w:r>
-      <w:r>
-        <w:rPr>
-          <w:rFonts w:ascii="Times New Roman" w:hAnsi="Times New Roman" w:cs="Times New Roman"/>
-          <w:sz w:val="26"/>
-          <w:szCs w:val="26"/>
-        </w:rPr>
-        <w:t>на основе трёх компонент</w:t>
-      </w:r>
-      <w:r>
-        <w:rPr>
-          <w:rFonts w:ascii="Times New Roman" w:hAnsi="Times New Roman" w:cs="Times New Roman"/>
-          <w:sz w:val="26"/>
-          <w:szCs w:val="26"/>
-        </w:rPr>
-        <w:t>:</w:t>
+        <w:t>от внедрения МО/ИИ-основанных подходов реализована на основе трёх компонент:</w:t>
       </w:r>
     </w:p>
     <w:p>
@@ -1080,7 +1274,6 @@
           <w:rFonts w:ascii="Times New Roman" w:eastAsiaTheme="minorEastAsia" w:hAnsi="Times New Roman" w:cs="Times New Roman"/>
           <w:sz w:val="26"/>
           <w:szCs w:val="26"/>
-          <w:lang w:val="en-US"/>
         </w:rPr>
       </w:pPr>
       <m:oMath>
@@ -1132,9 +1325,17 @@
             <w:rFonts w:ascii="Cambria Math" w:eastAsia="SimSun" w:hAnsi="Cambria Math" w:cs="Times New Roman"/>
             <w:sz w:val="26"/>
             <w:szCs w:val="26"/>
+          </w:rPr>
+          <m:t>*</m:t>
+        </m:r>
+        <m:r>
+          <w:rPr>
+            <w:rFonts w:ascii="Cambria Math" w:eastAsia="SimSun" w:hAnsi="Cambria Math" w:cs="Times New Roman"/>
+            <w:sz w:val="26"/>
+            <w:szCs w:val="26"/>
             <w:lang w:val="en-US"/>
           </w:rPr>
-          <m:t>*C</m:t>
+          <m:t>C</m:t>
         </m:r>
       </m:oMath>
       <w:r>
@@ -1142,7 +1343,6 @@
           <w:rFonts w:ascii="Times New Roman" w:eastAsiaTheme="minorEastAsia" w:hAnsi="Times New Roman" w:cs="Times New Roman"/>
           <w:sz w:val="26"/>
           <w:szCs w:val="26"/>
-          <w:lang w:val="en-US"/>
         </w:rPr>
         <w:tab/>
       </w:r>
@@ -1151,7 +1351,6 @@
           <w:rFonts w:ascii="Times New Roman" w:eastAsiaTheme="minorEastAsia" w:hAnsi="Times New Roman" w:cs="Times New Roman"/>
           <w:sz w:val="26"/>
           <w:szCs w:val="26"/>
-          <w:lang w:val="en-US"/>
         </w:rPr>
         <w:tab/>
       </w:r>
@@ -1160,7 +1359,6 @@
           <w:rFonts w:ascii="Times New Roman" w:eastAsiaTheme="minorEastAsia" w:hAnsi="Times New Roman" w:cs="Times New Roman"/>
           <w:sz w:val="26"/>
           <w:szCs w:val="26"/>
-          <w:lang w:val="en-US"/>
         </w:rPr>
         <w:tab/>
       </w:r>
@@ -1169,7 +1367,6 @@
           <w:rFonts w:ascii="Times New Roman" w:eastAsiaTheme="minorEastAsia" w:hAnsi="Times New Roman" w:cs="Times New Roman"/>
           <w:sz w:val="26"/>
           <w:szCs w:val="26"/>
-          <w:lang w:val="en-US"/>
         </w:rPr>
         <w:tab/>
       </w:r>
@@ -1178,7 +1375,6 @@
           <w:rFonts w:ascii="Times New Roman" w:eastAsiaTheme="minorEastAsia" w:hAnsi="Times New Roman" w:cs="Times New Roman"/>
           <w:sz w:val="26"/>
           <w:szCs w:val="26"/>
-          <w:lang w:val="en-US"/>
         </w:rPr>
         <w:tab/>
       </w:r>
@@ -1187,7 +1383,6 @@
           <w:rFonts w:ascii="Times New Roman" w:eastAsiaTheme="minorEastAsia" w:hAnsi="Times New Roman" w:cs="Times New Roman"/>
           <w:sz w:val="26"/>
           <w:szCs w:val="26"/>
-          <w:lang w:val="en-US"/>
         </w:rPr>
         <w:tab/>
         <w:t>(1)</w:t>
@@ -1294,15 +1489,7 @@
           <w:sz w:val="26"/>
           <w:szCs w:val="26"/>
         </w:rPr>
-        <w:t xml:space="preserve"> МО/ИИ-основанных подходов в конкретной задаче, а.</w:t>
-      </w:r>
-      <w:r>
-        <w:rPr>
-          <w:rFonts w:ascii="Times New Roman" w:hAnsi="Times New Roman" w:cs="Times New Roman"/>
-          <w:sz w:val="26"/>
-          <w:szCs w:val="26"/>
-        </w:rPr>
-        <w:t xml:space="preserve"> Все три коэффициента задаются в интервале от 0 до 1.</w:t>
+        <w:t xml:space="preserve"> МО/ИИ-основанных подходов в конкретной задаче, а. Все три коэффициента задаются в интервале от 0 до 1.</w:t>
       </w:r>
     </w:p>
     <w:p>
@@ -1392,7 +1579,6 @@
           <w:rFonts w:ascii="Times New Roman" w:eastAsiaTheme="minorEastAsia" w:hAnsi="Times New Roman" w:cs="Times New Roman"/>
           <w:sz w:val="26"/>
           <w:szCs w:val="26"/>
-          <w:lang w:val="en-US"/>
         </w:rPr>
       </w:pPr>
       <m:oMath>
@@ -1425,7 +1611,6 @@
                 <w:rFonts w:ascii="Cambria Math" w:eastAsia="SimSun" w:hAnsi="Cambria Math" w:cs="Times New Roman"/>
                 <w:sz w:val="26"/>
                 <w:szCs w:val="26"/>
-                <w:lang w:val="en-US"/>
               </w:rPr>
               <m:t>+</m:t>
             </m:r>
@@ -1485,7 +1670,6 @@
                 <w:rFonts w:ascii="Cambria Math" w:eastAsia="SimSun" w:hAnsi="Cambria Math" w:cs="Times New Roman"/>
                 <w:sz w:val="26"/>
                 <w:szCs w:val="26"/>
-                <w:lang w:val="en-US"/>
               </w:rPr>
               <m:t>+</m:t>
             </m:r>
@@ -1496,7 +1680,6 @@
             <w:rFonts w:ascii="Cambria Math" w:eastAsia="SimSun" w:hAnsi="Cambria Math" w:cs="Times New Roman"/>
             <w:sz w:val="26"/>
             <w:szCs w:val="26"/>
-            <w:lang w:val="en-US"/>
           </w:rPr>
           <m:t>*</m:t>
         </m:r>
@@ -1529,7 +1712,6 @@
                 <w:rFonts w:ascii="Cambria Math" w:eastAsia="SimSun" w:hAnsi="Cambria Math" w:cs="Times New Roman"/>
                 <w:sz w:val="26"/>
                 <w:szCs w:val="26"/>
-                <w:lang w:val="en-US"/>
               </w:rPr>
               <m:t>+</m:t>
             </m:r>
@@ -1541,7 +1723,6 @@
           <w:rFonts w:ascii="Times New Roman" w:eastAsiaTheme="minorEastAsia" w:hAnsi="Times New Roman" w:cs="Times New Roman"/>
           <w:sz w:val="26"/>
           <w:szCs w:val="26"/>
-          <w:lang w:val="en-US"/>
         </w:rPr>
         <w:tab/>
       </w:r>
@@ -1550,7 +1731,6 @@
           <w:rFonts w:ascii="Times New Roman" w:eastAsiaTheme="minorEastAsia" w:hAnsi="Times New Roman" w:cs="Times New Roman"/>
           <w:sz w:val="26"/>
           <w:szCs w:val="26"/>
-          <w:lang w:val="en-US"/>
         </w:rPr>
         <w:tab/>
       </w:r>
@@ -1559,7 +1739,6 @@
           <w:rFonts w:ascii="Times New Roman" w:eastAsiaTheme="minorEastAsia" w:hAnsi="Times New Roman" w:cs="Times New Roman"/>
           <w:sz w:val="26"/>
           <w:szCs w:val="26"/>
-          <w:lang w:val="en-US"/>
         </w:rPr>
         <w:tab/>
       </w:r>
@@ -1568,7 +1747,6 @@
           <w:rFonts w:ascii="Times New Roman" w:eastAsiaTheme="minorEastAsia" w:hAnsi="Times New Roman" w:cs="Times New Roman"/>
           <w:sz w:val="26"/>
           <w:szCs w:val="26"/>
-          <w:lang w:val="en-US"/>
         </w:rPr>
         <w:tab/>
       </w:r>
@@ -1577,7 +1755,6 @@
           <w:rFonts w:ascii="Times New Roman" w:eastAsiaTheme="minorEastAsia" w:hAnsi="Times New Roman" w:cs="Times New Roman"/>
           <w:sz w:val="26"/>
           <w:szCs w:val="26"/>
-          <w:lang w:val="en-US"/>
         </w:rPr>
         <w:tab/>
       </w:r>
@@ -1586,7 +1763,6 @@
           <w:rFonts w:ascii="Times New Roman" w:eastAsiaTheme="minorEastAsia" w:hAnsi="Times New Roman" w:cs="Times New Roman"/>
           <w:sz w:val="26"/>
           <w:szCs w:val="26"/>
-          <w:lang w:val="en-US"/>
         </w:rPr>
         <w:tab/>
         <w:t>(</w:t>
@@ -1604,7 +1780,6 @@
           <w:rFonts w:ascii="Times New Roman" w:eastAsiaTheme="minorEastAsia" w:hAnsi="Times New Roman" w:cs="Times New Roman"/>
           <w:sz w:val="26"/>
           <w:szCs w:val="26"/>
-          <w:lang w:val="en-US"/>
         </w:rPr>
         <w:t>)</w:t>
       </w:r>
@@ -1654,7 +1829,6 @@
                 <w:rFonts w:ascii="Cambria Math" w:eastAsia="SimSun" w:hAnsi="Cambria Math" w:cs="Times New Roman"/>
                 <w:sz w:val="26"/>
                 <w:szCs w:val="26"/>
-                <w:lang w:val="en-US"/>
               </w:rPr>
               <m:t>-</m:t>
             </m:r>
@@ -1714,7 +1888,6 @@
                 <w:rFonts w:ascii="Cambria Math" w:eastAsia="SimSun" w:hAnsi="Cambria Math" w:cs="Times New Roman"/>
                 <w:sz w:val="26"/>
                 <w:szCs w:val="26"/>
-                <w:lang w:val="en-US"/>
               </w:rPr>
               <m:t>-</m:t>
             </m:r>
@@ -1725,7 +1898,6 @@
             <w:rFonts w:ascii="Cambria Math" w:eastAsia="SimSun" w:hAnsi="Cambria Math" w:cs="Times New Roman"/>
             <w:sz w:val="26"/>
             <w:szCs w:val="26"/>
-            <w:lang w:val="en-US"/>
           </w:rPr>
           <m:t>*</m:t>
         </m:r>
@@ -1758,7 +1930,6 @@
                 <w:rFonts w:ascii="Cambria Math" w:eastAsia="SimSun" w:hAnsi="Cambria Math" w:cs="Times New Roman"/>
                 <w:sz w:val="26"/>
                 <w:szCs w:val="26"/>
-                <w:lang w:val="en-US"/>
               </w:rPr>
               <m:t>-</m:t>
             </m:r>
@@ -1770,7 +1941,6 @@
           <w:rFonts w:ascii="Times New Roman" w:eastAsiaTheme="minorEastAsia" w:hAnsi="Times New Roman" w:cs="Times New Roman"/>
           <w:sz w:val="26"/>
           <w:szCs w:val="26"/>
-          <w:lang w:val="en-US"/>
         </w:rPr>
         <w:tab/>
       </w:r>
@@ -1779,7 +1949,6 @@
           <w:rFonts w:ascii="Times New Roman" w:eastAsiaTheme="minorEastAsia" w:hAnsi="Times New Roman" w:cs="Times New Roman"/>
           <w:sz w:val="26"/>
           <w:szCs w:val="26"/>
-          <w:lang w:val="en-US"/>
         </w:rPr>
         <w:tab/>
       </w:r>
@@ -1788,7 +1957,6 @@
           <w:rFonts w:ascii="Times New Roman" w:eastAsiaTheme="minorEastAsia" w:hAnsi="Times New Roman" w:cs="Times New Roman"/>
           <w:sz w:val="26"/>
           <w:szCs w:val="26"/>
-          <w:lang w:val="en-US"/>
         </w:rPr>
         <w:tab/>
       </w:r>
@@ -1797,7 +1965,6 @@
           <w:rFonts w:ascii="Times New Roman" w:eastAsiaTheme="minorEastAsia" w:hAnsi="Times New Roman" w:cs="Times New Roman"/>
           <w:sz w:val="26"/>
           <w:szCs w:val="26"/>
-          <w:lang w:val="en-US"/>
         </w:rPr>
         <w:tab/>
       </w:r>
@@ -1806,7 +1973,6 @@
           <w:rFonts w:ascii="Times New Roman" w:eastAsiaTheme="minorEastAsia" w:hAnsi="Times New Roman" w:cs="Times New Roman"/>
           <w:sz w:val="26"/>
           <w:szCs w:val="26"/>
-          <w:lang w:val="en-US"/>
         </w:rPr>
         <w:tab/>
       </w:r>
@@ -1815,7 +1981,6 @@
           <w:rFonts w:ascii="Times New Roman" w:eastAsiaTheme="minorEastAsia" w:hAnsi="Times New Roman" w:cs="Times New Roman"/>
           <w:sz w:val="26"/>
           <w:szCs w:val="26"/>
-          <w:lang w:val="en-US"/>
         </w:rPr>
         <w:tab/>
       </w:r>
@@ -1927,23 +2092,7 @@
           <w:sz w:val="26"/>
           <w:szCs w:val="26"/>
         </w:rPr>
-        <w:t>, а верхний индекс (+</w:t>
-      </w:r>
-      <w:r>
-        <w:rPr>
-          <w:rFonts w:ascii="Times New Roman" w:eastAsiaTheme="minorEastAsia" w:hAnsi="Times New Roman" w:cs="Times New Roman"/>
-          <w:sz w:val="26"/>
-          <w:szCs w:val="26"/>
-        </w:rPr>
-        <w:t>)</w:t>
-      </w:r>
-      <w:r>
-        <w:rPr>
-          <w:rFonts w:ascii="Times New Roman" w:eastAsiaTheme="minorEastAsia" w:hAnsi="Times New Roman" w:cs="Times New Roman"/>
-          <w:sz w:val="26"/>
-          <w:szCs w:val="26"/>
-        </w:rPr>
-        <w:t xml:space="preserve"> для максимальных значений компонент.</w:t>
+        <w:t>, а верхний индекс (+) для максимальных значений компонент.</w:t>
       </w:r>
       <w:r>
         <w:rPr>
@@ -1953,8 +2102,6 @@
         </w:rPr>
         <w:t xml:space="preserve"> </w:t>
       </w:r>
-      <w:bookmarkStart w:id="0" w:name="_GoBack"/>
-      <w:bookmarkEnd w:id="0"/>
       <w:r>
         <w:rPr>
           <w:rFonts w:ascii="Times New Roman" w:hAnsi="Times New Roman" w:cs="Times New Roman"/>
@@ -2092,15 +2239,7 @@
             <w:sz w:val="26"/>
             <w:szCs w:val="26"/>
           </w:rPr>
-          <m:t>-</m:t>
-        </m:r>
-        <m:r>
-          <w:rPr>
-            <w:rFonts w:ascii="Cambria Math" w:eastAsiaTheme="minorEastAsia" w:hAnsi="Cambria Math" w:cs="Times New Roman"/>
-            <w:sz w:val="26"/>
-            <w:szCs w:val="26"/>
-          </w:rPr>
-          <m:t>0,1</m:t>
+          <m:t>-0,1</m:t>
         </m:r>
       </m:oMath>
       <w:r>
@@ -2109,23 +2248,7 @@
           <w:sz w:val="26"/>
           <w:szCs w:val="26"/>
         </w:rPr>
-        <w:t xml:space="preserve">, то есть </w:t>
-      </w:r>
-      <w:r>
-        <w:rPr>
-          <w:rFonts w:ascii="Times New Roman" w:eastAsiaTheme="minorEastAsia" w:hAnsi="Times New Roman" w:cs="Times New Roman"/>
-          <w:sz w:val="26"/>
-          <w:szCs w:val="26"/>
-        </w:rPr>
-        <w:t>вводится штраф для качества внедрения в</w:t>
-      </w:r>
-      <w:r>
-        <w:rPr>
-          <w:rFonts w:ascii="Times New Roman" w:eastAsiaTheme="minorEastAsia" w:hAnsi="Times New Roman" w:cs="Times New Roman"/>
-          <w:sz w:val="26"/>
-          <w:szCs w:val="26"/>
-        </w:rPr>
-        <w:t xml:space="preserve"> 10%, чтобы отразить неучтенные обстоятельства, которые могут возникнуть в ходе разработки. При этом исключением является уровень УГТ-1 и УГТ-2, где вероятность качественного внедрения низкая, то есть в этих случаях </w:t>
+        <w:t xml:space="preserve">, то есть вводится штраф для качества внедрения в 10%, чтобы отразить неучтенные обстоятельства, которые могут возникнуть в ходе разработки. При этом исключением является уровень УГТ-1 и УГТ-2, где вероятность качественного внедрения низкая, то есть в этих случаях </w:t>
       </w:r>
       <m:oMath>
         <m:sSup>
@@ -2393,7 +2516,53 @@
         </w:rPr>
         <w:t xml:space="preserve"> = {</w:t>
       </w:r>
+    </w:p>
+    <w:p>
+      <w:pPr>
+        <w:tabs>
+          <w:tab w:val="left" w:pos="851"/>
+        </w:tabs>
+        <w:spacing w:after="0" w:line="360" w:lineRule="auto"/>
+        <w:ind w:left="-567" w:firstLine="567"/>
+        <w:jc w:val="both"/>
+        <w:rPr>
+          <w:rFonts w:ascii="Consolas" w:hAnsi="Consolas" w:cs="Times New Roman"/>
+        </w:rPr>
+      </w:pPr>
+      <w:r>
+        <w:rPr>
+          <w:rFonts w:ascii="Consolas" w:hAnsi="Consolas" w:cs="Times New Roman"/>
+        </w:rPr>
+        <w:t>"Оптимизация": {'</w:t>
+      </w:r>
       <w:proofErr w:type="spellStart"/>
+      <w:r>
+        <w:rPr>
+          <w:rFonts w:ascii="Consolas" w:hAnsi="Consolas" w:cs="Times New Roman"/>
+        </w:rPr>
+        <w:t>min</w:t>
+      </w:r>
+      <w:proofErr w:type="spellEnd"/>
+      <w:r>
+        <w:rPr>
+          <w:rFonts w:ascii="Consolas" w:hAnsi="Consolas" w:cs="Times New Roman"/>
+        </w:rPr>
+        <w:t>': 0.1, '</w:t>
+      </w:r>
+      <w:proofErr w:type="spellStart"/>
+      <w:r>
+        <w:rPr>
+          <w:rFonts w:ascii="Consolas" w:hAnsi="Consolas" w:cs="Times New Roman"/>
+        </w:rPr>
+        <w:t>max</w:t>
+      </w:r>
+      <w:proofErr w:type="spellEnd"/>
+      <w:r>
+        <w:rPr>
+          <w:rFonts w:ascii="Consolas" w:hAnsi="Consolas" w:cs="Times New Roman"/>
+        </w:rPr>
+        <w:t>': 0.3},</w:t>
+      </w:r>
     </w:p>
     <w:p>
       <w:pPr>
@@ -2407,18 +2576,64 @@
           <w:rFonts w:ascii="Consolas" w:hAnsi="Consolas" w:cs="Times New Roman"/>
         </w:rPr>
       </w:pPr>
+      <w:r>
+        <w:rPr>
+          <w:rFonts w:ascii="Consolas" w:hAnsi="Consolas" w:cs="Times New Roman"/>
+        </w:rPr>
+        <w:t xml:space="preserve">    "Прогнозирование": {'</w:t>
+      </w:r>
+      <w:proofErr w:type="spellStart"/>
+      <w:r>
+        <w:rPr>
+          <w:rFonts w:ascii="Consolas" w:hAnsi="Consolas" w:cs="Times New Roman"/>
+        </w:rPr>
+        <w:t>min</w:t>
+      </w:r>
       <w:proofErr w:type="spellEnd"/>
       <w:r>
         <w:rPr>
           <w:rFonts w:ascii="Consolas" w:hAnsi="Consolas" w:cs="Times New Roman"/>
         </w:rPr>
-        <w:t>"Оптимизация": {'</w:t>
+        <w:t>': 0.1, '</w:t>
       </w:r>
       <w:proofErr w:type="spellStart"/>
       <w:r>
         <w:rPr>
           <w:rFonts w:ascii="Consolas" w:hAnsi="Consolas" w:cs="Times New Roman"/>
         </w:rPr>
+        <w:t>max</w:t>
+      </w:r>
+      <w:proofErr w:type="spellEnd"/>
+      <w:r>
+        <w:rPr>
+          <w:rFonts w:ascii="Consolas" w:hAnsi="Consolas" w:cs="Times New Roman"/>
+        </w:rPr>
+        <w:t>': 0.3},</w:t>
+      </w:r>
+    </w:p>
+    <w:p>
+      <w:pPr>
+        <w:tabs>
+          <w:tab w:val="left" w:pos="851"/>
+        </w:tabs>
+        <w:spacing w:after="0" w:line="360" w:lineRule="auto"/>
+        <w:ind w:left="-567" w:firstLine="567"/>
+        <w:jc w:val="both"/>
+        <w:rPr>
+          <w:rFonts w:ascii="Consolas" w:hAnsi="Consolas" w:cs="Times New Roman"/>
+        </w:rPr>
+      </w:pPr>
+      <w:r>
+        <w:rPr>
+          <w:rFonts w:ascii="Consolas" w:hAnsi="Consolas" w:cs="Times New Roman"/>
+        </w:rPr>
+        <w:t xml:space="preserve">    "Распознавание": {'</w:t>
+      </w:r>
+      <w:proofErr w:type="spellStart"/>
+      <w:r>
+        <w:rPr>
+          <w:rFonts w:ascii="Consolas" w:hAnsi="Consolas" w:cs="Times New Roman"/>
+        </w:rPr>
         <w:t>min</w:t>
       </w:r>
       <w:proofErr w:type="spellEnd"/>
@@ -2426,7 +2641,7 @@
         <w:rPr>
           <w:rFonts w:ascii="Consolas" w:hAnsi="Consolas" w:cs="Times New Roman"/>
         </w:rPr>
-        <w:t>': 0.1, '</w:t>
+        <w:t>': 0.5, '</w:t>
       </w:r>
       <w:proofErr w:type="spellStart"/>
       <w:r>
@@ -2440,7 +2655,7 @@
         <w:rPr>
           <w:rFonts w:ascii="Consolas" w:hAnsi="Consolas" w:cs="Times New Roman"/>
         </w:rPr>
-        <w:t>': 0.3},</w:t>
+        <w:t>': 0.9},</w:t>
       </w:r>
     </w:p>
     <w:p>
@@ -2459,7 +2674,7 @@
         <w:rPr>
           <w:rFonts w:ascii="Consolas" w:hAnsi="Consolas" w:cs="Times New Roman"/>
         </w:rPr>
-        <w:t xml:space="preserve">    "Прогнозирование": {'</w:t>
+        <w:t xml:space="preserve">    "Логистика": {'</w:t>
       </w:r>
       <w:proofErr w:type="spellStart"/>
       <w:r>
@@ -2473,7 +2688,7 @@
         <w:rPr>
           <w:rFonts w:ascii="Consolas" w:hAnsi="Consolas" w:cs="Times New Roman"/>
         </w:rPr>
-        <w:t>': 0.1, '</w:t>
+        <w:t>': 0.05, '</w:t>
       </w:r>
       <w:proofErr w:type="spellStart"/>
       <w:r>
@@ -2487,7 +2702,7 @@
         <w:rPr>
           <w:rFonts w:ascii="Consolas" w:hAnsi="Consolas" w:cs="Times New Roman"/>
         </w:rPr>
-        <w:t>': 0.3},</w:t>
+        <w:t>': 0.15},</w:t>
       </w:r>
     </w:p>
     <w:p>
@@ -2506,182 +2721,70 @@
         <w:rPr>
           <w:rFonts w:ascii="Consolas" w:hAnsi="Consolas" w:cs="Times New Roman"/>
         </w:rPr>
-        <w:t xml:space="preserve">    "</w:t>
-      </w:r>
-      <w:r>
+        <w:t xml:space="preserve">    "Комбинаторный поиск": {'min': 0.05, 'max': 0.1}</w:t>
+      </w:r>
+    </w:p>
+    <w:p>
+      <w:pPr>
+        <w:tabs>
+          <w:tab w:val="left" w:pos="851"/>
+        </w:tabs>
+        <w:spacing w:after="0" w:line="360" w:lineRule="auto"/>
+        <w:ind w:left="-567" w:firstLine="567"/>
+        <w:jc w:val="both"/>
         <w:rPr>
           <w:rFonts w:ascii="Consolas" w:hAnsi="Consolas" w:cs="Times New Roman"/>
         </w:rPr>
-        <w:t>Распознавание</w:t>
-      </w:r>
+      </w:pPr>
       <w:r>
         <w:rPr>
           <w:rFonts w:ascii="Consolas" w:hAnsi="Consolas" w:cs="Times New Roman"/>
         </w:rPr>
-        <w:t>": {'</w:t>
+        <w:t>}.</w:t>
+      </w:r>
+    </w:p>
+    <w:p>
+      <w:pPr>
+        <w:tabs>
+          <w:tab w:val="left" w:pos="851"/>
+        </w:tabs>
+        <w:spacing w:after="0" w:line="360" w:lineRule="auto"/>
+        <w:ind w:left="-567" w:firstLine="567"/>
+        <w:jc w:val="both"/>
+        <w:rPr>
+          <w:rFonts w:ascii="Times New Roman" w:hAnsi="Times New Roman" w:cs="Times New Roman"/>
+          <w:sz w:val="26"/>
+          <w:szCs w:val="26"/>
+        </w:rPr>
+      </w:pPr>
+      <w:r>
+        <w:rPr>
+          <w:rFonts w:ascii="Times New Roman" w:hAnsi="Times New Roman" w:cs="Times New Roman"/>
+          <w:sz w:val="26"/>
+          <w:szCs w:val="26"/>
+        </w:rPr>
+        <w:t>Вероятность реализации качественного внедрения определяется исходя из уровня технологической готовности (УГТ) конкретного технического процесса. Шкала УГТ предлагает градацию от возникновения идеи (УГТ-1) до эксплуатационного применения (УГТ-9). Под каждый уровень была сформирована приблизительная вероятность качественного внедрен</w:t>
+      </w:r>
+      <w:r>
+        <w:rPr>
+          <w:rFonts w:ascii="Times New Roman" w:hAnsi="Times New Roman" w:cs="Times New Roman"/>
+          <w:sz w:val="26"/>
+          <w:szCs w:val="26"/>
+        </w:rPr>
+        <w:t xml:space="preserve">ия исходя из </w:t>
       </w:r>
       <w:proofErr w:type="spellStart"/>
       <w:r>
         <w:rPr>
-          <w:rFonts w:ascii="Consolas" w:hAnsi="Consolas" w:cs="Times New Roman"/>
-        </w:rPr>
-        <w:t>min</w:t>
+          <w:rFonts w:ascii="Times New Roman" w:hAnsi="Times New Roman" w:cs="Times New Roman"/>
+          <w:sz w:val="26"/>
+          <w:szCs w:val="26"/>
+        </w:rPr>
+        <w:t>сигмоидной</w:t>
       </w:r>
       <w:proofErr w:type="spellEnd"/>
       <w:r>
         <w:rPr>
-          <w:rFonts w:ascii="Consolas" w:hAnsi="Consolas" w:cs="Times New Roman"/>
-        </w:rPr>
-        <w:t>': 0.5, '</w:t>
-      </w:r>
-      <w:proofErr w:type="spellStart"/>
-      <w:r>
-        <w:rPr>
-          <w:rFonts w:ascii="Consolas" w:hAnsi="Consolas" w:cs="Times New Roman"/>
-        </w:rPr>
-        <w:t>max</w:t>
-      </w:r>
-      <w:proofErr w:type="spellEnd"/>
-      <w:r>
-        <w:rPr>
-          <w:rFonts w:ascii="Consolas" w:hAnsi="Consolas" w:cs="Times New Roman"/>
-        </w:rPr>
-        <w:t>': 0.9},</w:t>
-      </w:r>
-    </w:p>
-    <w:p>
-      <w:pPr>
-        <w:tabs>
-          <w:tab w:val="left" w:pos="851"/>
-        </w:tabs>
-        <w:spacing w:after="0" w:line="360" w:lineRule="auto"/>
-        <w:ind w:left="-567" w:firstLine="567"/>
-        <w:jc w:val="both"/>
-        <w:rPr>
-          <w:rFonts w:ascii="Consolas" w:hAnsi="Consolas" w:cs="Times New Roman"/>
-        </w:rPr>
-      </w:pPr>
-      <w:r>
-        <w:rPr>
-          <w:rFonts w:ascii="Consolas" w:hAnsi="Consolas" w:cs="Times New Roman"/>
-        </w:rPr>
-        <w:t xml:space="preserve">    "Логистика": {'</w:t>
-      </w:r>
-      <w:proofErr w:type="spellStart"/>
-      <w:r>
-        <w:rPr>
-          <w:rFonts w:ascii="Consolas" w:hAnsi="Consolas" w:cs="Times New Roman"/>
-        </w:rPr>
-        <w:t>min</w:t>
-      </w:r>
-      <w:proofErr w:type="spellEnd"/>
-      <w:r>
-        <w:rPr>
-          <w:rFonts w:ascii="Consolas" w:hAnsi="Consolas" w:cs="Times New Roman"/>
-        </w:rPr>
-        <w:t>': 0.05, '</w:t>
-      </w:r>
-      <w:proofErr w:type="spellStart"/>
-      <w:r>
-        <w:rPr>
-          <w:rFonts w:ascii="Consolas" w:hAnsi="Consolas" w:cs="Times New Roman"/>
-        </w:rPr>
-        <w:t>max</w:t>
-      </w:r>
-      <w:proofErr w:type="spellEnd"/>
-      <w:r>
-        <w:rPr>
-          <w:rFonts w:ascii="Consolas" w:hAnsi="Consolas" w:cs="Times New Roman"/>
-        </w:rPr>
-        <w:t>': 0.15},</w:t>
-      </w:r>
-    </w:p>
-    <w:p>
-      <w:pPr>
-        <w:tabs>
-          <w:tab w:val="left" w:pos="851"/>
-        </w:tabs>
-        <w:spacing w:after="0" w:line="360" w:lineRule="auto"/>
-        <w:ind w:left="-567" w:firstLine="567"/>
-        <w:jc w:val="both"/>
-        <w:rPr>
-          <w:rFonts w:ascii="Consolas" w:hAnsi="Consolas" w:cs="Times New Roman"/>
-        </w:rPr>
-      </w:pPr>
-      <w:r>
-        <w:rPr>
-          <w:rFonts w:ascii="Consolas" w:hAnsi="Consolas" w:cs="Times New Roman"/>
-        </w:rPr>
-        <w:t xml:space="preserve">    "Комбинаторный поиск": {'min': 0.05, 'max': 0.1}</w:t>
-      </w:r>
-    </w:p>
-    <w:p>
-      <w:pPr>
-        <w:tabs>
-          <w:tab w:val="left" w:pos="851"/>
-        </w:tabs>
-        <w:spacing w:after="0" w:line="360" w:lineRule="auto"/>
-        <w:ind w:left="-567" w:firstLine="567"/>
-        <w:jc w:val="both"/>
-        <w:rPr>
-          <w:rFonts w:ascii="Consolas" w:hAnsi="Consolas" w:cs="Times New Roman"/>
-        </w:rPr>
-      </w:pPr>
-      <w:r>
-        <w:rPr>
-          <w:rFonts w:ascii="Consolas" w:hAnsi="Consolas" w:cs="Times New Roman"/>
-        </w:rPr>
-        <w:t>}</w:t>
-      </w:r>
-      <w:r>
-        <w:rPr>
-          <w:rFonts w:ascii="Consolas" w:hAnsi="Consolas" w:cs="Times New Roman"/>
-        </w:rPr>
-        <w:t>.</w:t>
-      </w:r>
-    </w:p>
-    <w:p>
-      <w:pPr>
-        <w:tabs>
-          <w:tab w:val="left" w:pos="851"/>
-        </w:tabs>
-        <w:spacing w:after="0" w:line="360" w:lineRule="auto"/>
-        <w:ind w:left="-567" w:firstLine="567"/>
-        <w:jc w:val="both"/>
-        <w:rPr>
-          <w:rFonts w:ascii="Times New Roman" w:hAnsi="Times New Roman" w:cs="Times New Roman"/>
-          <w:sz w:val="26"/>
-          <w:szCs w:val="26"/>
-        </w:rPr>
-      </w:pPr>
-      <w:r>
-        <w:rPr>
-          <w:rFonts w:ascii="Times New Roman" w:hAnsi="Times New Roman" w:cs="Times New Roman"/>
-          <w:sz w:val="26"/>
-          <w:szCs w:val="26"/>
-        </w:rPr>
-        <w:t>Вероятность реализации качественного внедрения определяется исходя из уровня технологической готовности (УГТ) конкретного технического процесса. Шкала УГТ предлагает градацию от возникновения идеи (УГТ-1) до эксплуатационного применения (УГТ-9). Под каждый уровень была сформирована приблизительная вероятность качественного внедрен</w:t>
-      </w:r>
-      <w:r>
-        <w:rPr>
-          <w:rFonts w:ascii="Times New Roman" w:hAnsi="Times New Roman" w:cs="Times New Roman"/>
-          <w:sz w:val="26"/>
-          <w:szCs w:val="26"/>
-        </w:rPr>
-        <w:t xml:space="preserve">ия исходя из </w:t>
-      </w:r>
-      <w:proofErr w:type="spellStart"/>
-      <w:r>
-        <w:rPr>
-          <w:rFonts w:ascii="Times New Roman" w:hAnsi="Times New Roman" w:cs="Times New Roman"/>
-          <w:sz w:val="26"/>
-          <w:szCs w:val="26"/>
-        </w:rPr>
-        <w:t>сигмоидной</w:t>
-      </w:r>
-      <w:proofErr w:type="spellEnd"/>
-      <w:r>
-        <w:rPr>
           <w:rFonts w:ascii="Times New Roman" w:hAnsi="Times New Roman" w:cs="Times New Roman"/>
           <w:sz w:val="26"/>
           <w:szCs w:val="26"/>
@@ -2702,7 +2805,23 @@
           <w:sz w:val="26"/>
           <w:szCs w:val="26"/>
         </w:rPr>
-        <w:t>см. рис. 4).</w:t>
+        <w:t xml:space="preserve">см. рис. </w:t>
+      </w:r>
+      <w:r>
+        <w:rPr>
+          <w:rFonts w:ascii="Times New Roman" w:hAnsi="Times New Roman" w:cs="Times New Roman"/>
+          <w:sz w:val="26"/>
+          <w:szCs w:val="26"/>
+        </w:rPr>
+        <w:t>5</w:t>
+      </w:r>
+      <w:r>
+        <w:rPr>
+          <w:rFonts w:ascii="Times New Roman" w:hAnsi="Times New Roman" w:cs="Times New Roman"/>
+          <w:sz w:val="26"/>
+          <w:szCs w:val="26"/>
+        </w:rPr>
+        <w:t>).</w:t>
       </w:r>
     </w:p>
     <w:p>
@@ -2744,8 +2863,8 @@
         </w:rPr>
         <w:lastRenderedPageBreak/>
         <w:pict>
-          <v:shape id="_x0000_i1028" type="#_x0000_t75" style="width:402pt;height:302.25pt">
-            <v:imagedata r:id="rId8" o:title="Figure_1"/>
+          <v:shape id="_x0000_i1028" type="#_x0000_t75" style="width:402.1pt;height:302.25pt">
+            <v:imagedata r:id="rId9" o:title="Figure_1"/>
           </v:shape>
         </w:pict>
       </w:r>
@@ -2770,7 +2889,24 @@
           <w:sz w:val="26"/>
           <w:szCs w:val="26"/>
         </w:rPr>
-        <w:t>Рис. 4. Распределение вероятности качественного внедрения при разном УГТ</w:t>
+        <w:t xml:space="preserve">Рис. </w:t>
+      </w:r>
+      <w:r>
+        <w:rPr>
+          <w:rFonts w:ascii="Times New Roman" w:hAnsi="Times New Roman" w:cs="Times New Roman"/>
+          <w:sz w:val="26"/>
+          <w:szCs w:val="26"/>
+          <w:lang w:val="en-US"/>
+        </w:rPr>
+        <w:t>5</w:t>
+      </w:r>
+      <w:r>
+        <w:rPr>
+          <w:rFonts w:ascii="Times New Roman" w:hAnsi="Times New Roman" w:cs="Times New Roman"/>
+          <w:sz w:val="26"/>
+          <w:szCs w:val="26"/>
+        </w:rPr>
+        <w:t>. Распределение вероятности качественного внедрения при разном УГТ</w:t>
       </w:r>
     </w:p>
     <w:sectPr>

</xml_diff>